<commit_message>
feat: replace keyword parser with embedding-based CV analysis
</commit_message>
<xml_diff>
--- a/Daniel-Hlinka-CV-EN.docx
+++ b/Daniel-Hlinka-CV-EN.docx
@@ -246,7 +246,23 @@
           <w:b/>
           <w:color w:val="000000"/>
         </w:rPr>
-        <w:t>June 2025 – September 2025</w:t>
+        <w:t>2025 –</w:t>
+      </w:r>
+      <w:r>
+        <w:rPr>
+          <w:rFonts w:eastAsia="Georgia" w:hAnsi="Georgia" w:cs="Georgia"/>
+          <w:b/>
+          <w:color w:val="000000"/>
+        </w:rPr>
+        <w:t xml:space="preserve"> </w:t>
+      </w:r>
+      <w:r>
+        <w:rPr>
+          <w:rFonts w:eastAsia="Georgia" w:hAnsi="Georgia" w:cs="Georgia"/>
+          <w:b/>
+          <w:color w:val="000000"/>
+        </w:rPr>
+        <w:t>2025</w:t>
       </w:r>
     </w:p>
     <w:p>
@@ -360,7 +376,23 @@
           <w:b/>
           <w:color w:val="000000"/>
         </w:rPr>
-        <w:t>November 2022 – December 2023</w:t>
+        <w:t>2022 –</w:t>
+      </w:r>
+      <w:r>
+        <w:rPr>
+          <w:rFonts w:eastAsia="Georgia" w:hAnsi="Georgia" w:cs="Georgia"/>
+          <w:b/>
+          <w:color w:val="000000"/>
+        </w:rPr>
+        <w:t xml:space="preserve"> </w:t>
+      </w:r>
+      <w:r>
+        <w:rPr>
+          <w:rFonts w:eastAsia="Georgia" w:hAnsi="Georgia" w:cs="Georgia"/>
+          <w:b/>
+          <w:color w:val="000000"/>
+        </w:rPr>
+        <w:t>2023</w:t>
       </w:r>
     </w:p>
     <w:p>

</xml_diff>